<commit_message>
refactor(usecase): doi tac nhan Ban quan ly KTX thanh He thong (System) theo yeu cau
</commit_message>
<xml_diff>
--- a/docs/Tai_Lieu_Giai_Thich_So_Do_Use_Case_KTX.docx
+++ b/docs/Tai_Lieu_Giai_Thich_So_Do_Use_Case_KTX.docx
@@ -626,7 +626,7 @@
                 <w:color w:val="166534"/>
                 <w:sz w:val="19"/>
               </w:rPr>
-              <w:t>Thiết lập quy trình Phê duyệt nghiệp vụ (UC-09, BR-03): BQL duyệt hồ sơ trường A, tư cách sinh viên và kỷ luật trước khi phân phòng.</w:t>
+              <w:t>Thiết lập quy trình Phê duyệt nghiệp vụ (UC-09, BR-03): Hệ thống duyệt hồ sơ trường A, tư cách sinh viên và kỷ luật trước khi phân phòng.</w:t>
             </w:r>
           </w:p>
         </w:tc>
@@ -717,7 +717,7 @@
                 <w:color w:val="166534"/>
                 <w:sz w:val="19"/>
               </w:rPr>
-              <w:t>Bổ sung UC-13 (BQL Quản lý danh mục phòng: 2, 4, 6 người, giá thuê) và UC-07 (Sinh viên chọn loại phòng &amp; máy lạnh theo ngân sách).</w:t>
+              <w:t>Bổ sung UC-13 (Hệ thống Quản lý danh mục phòng: 2, 4, 6 người, giá thuê) và UC-07 (Sinh viên chọn loại phòng &amp; máy lạnh theo ngân sách).</w:t>
             </w:r>
           </w:p>
         </w:tc>
@@ -1174,7 +1174,7 @@
           <w:color w:val="2C5282"/>
           <w:sz w:val="25"/>
         </w:rPr>
-        <w:t>3.2 Tác nhân Ban quản lý KTX (Dormitory Management - Business Actor)</w:t>
+        <w:t>3.2 Tác nhân Hệ thống KTX (System - System/Managing Actor)</w:t>
       </w:r>
     </w:p>
     <w:p>
@@ -1704,7 +1704,7 @@
                 <w:color w:val="374151"/>
                 <w:sz w:val="18"/>
               </w:rPr>
-              <w:t>Sinh viên, BQL</w:t>
+              <w:t>Sinh viên, Hệ thống</w:t>
             </w:r>
           </w:p>
         </w:tc>
@@ -2747,7 +2747,7 @@
                 <w:color w:val="374151"/>
                 <w:sz w:val="18"/>
               </w:rPr>
-              <w:t>Ban quản lý KTX</w:t>
+              <w:t>Hệ thống (System)</w:t>
             </w:r>
           </w:p>
         </w:tc>
@@ -2806,7 +2806,7 @@
                 <w:color w:val="374151"/>
                 <w:sz w:val="18"/>
               </w:rPr>
-              <w:t>BQL kiểm duyệt điều kiện trường A, kỷ luật trước khi phân phòng (BR-03).</w:t>
+              <w:t>Hệ thống kiểm duyệt điều kiện trường A, kỷ luật trước khi phân phòng (BR-03).</w:t>
             </w:r>
           </w:p>
         </w:tc>
@@ -3343,7 +3343,7 @@
                 <w:color w:val="374151"/>
                 <w:sz w:val="18"/>
               </w:rPr>
-              <w:t>Ban quản lý KTX</w:t>
+              <w:t>Hệ thống (System)</w:t>
             </w:r>
           </w:p>
         </w:tc>
@@ -3492,7 +3492,7 @@
                 <w:color w:val="374151"/>
                 <w:sz w:val="18"/>
               </w:rPr>
-              <w:t>Ban quản lý KTX</w:t>
+              <w:t>Hệ thống (System)</w:t>
             </w:r>
           </w:p>
         </w:tc>
@@ -3641,7 +3641,7 @@
                 <w:color w:val="374151"/>
                 <w:sz w:val="18"/>
               </w:rPr>
-              <w:t>Ban quản lý KTX</w:t>
+              <w:t>Hệ thống (System)</w:t>
             </w:r>
           </w:p>
         </w:tc>
@@ -4535,7 +4535,7 @@
                 <w:color w:val="374151"/>
                 <w:sz w:val="18"/>
               </w:rPr>
-              <w:t>Ban quản lý KTX</w:t>
+              <w:t>Hệ thống (System)</w:t>
             </w:r>
           </w:p>
         </w:tc>
@@ -4833,7 +4833,7 @@
                 <w:color w:val="374151"/>
                 <w:sz w:val="18"/>
               </w:rPr>
-              <w:t>Ban quản lý KTX</w:t>
+              <w:t>Hệ thống (System)</w:t>
             </w:r>
           </w:p>
         </w:tc>
@@ -4982,7 +4982,7 @@
                 <w:color w:val="374151"/>
                 <w:sz w:val="18"/>
               </w:rPr>
-              <w:t>Ban quản lý KTX</w:t>
+              <w:t>Hệ thống (System)</w:t>
             </w:r>
           </w:p>
         </w:tc>
@@ -5131,7 +5131,7 @@
                 <w:color w:val="374151"/>
                 <w:sz w:val="18"/>
               </w:rPr>
-              <w:t>Ban quản lý KTX</w:t>
+              <w:t>Hệ thống (System)</w:t>
             </w:r>
           </w:p>
         </w:tc>
@@ -5364,7 +5364,7 @@
           <w:color w:val="374151"/>
           <w:sz w:val="24"/>
         </w:rPr>
-        <w:t>Ban quản lý KTX (Cán bộ phê duyệt).</w:t>
+        <w:t>Hệ thống (System) (Cán bộ phê duyệt).</w:t>
       </w:r>
     </w:p>
     <w:p>
@@ -5436,7 +5436,7 @@
           <w:color w:val="374151"/>
           <w:sz w:val="24"/>
         </w:rPr>
-        <w:t>Cán bộ BQL mở màn hình duyệt đơn. Hệ thống tự động gán nhãn xanh cho hồ sơ hợp lệ. BQL kiểm tra hạn ngạch phòng, đối chiếu kỷ luật cũ và nhấn 'Business Approve' chuyển hồ sơ sang trạng thái 'Approved'. Các hồ sơ này mới được nạp vào hàng đợi chạy Gale-Shapley.</w:t>
+        <w:t>Cán bộ Hệ thống mở màn hình duyệt đơn. Hệ thống tự động gán nhãn xanh cho hồ sơ hợp lệ. Hệ thống kiểm tra hạn ngạch phòng, đối chiếu kỷ luật cũ và nhấn 'Business Approve' chuyển hồ sơ sang trạng thái 'Approved'. Các hồ sơ này mới được nạp vào hàng đợi chạy Gale-Shapley.</w:t>
       </w:r>
     </w:p>
     <w:p>
@@ -5475,7 +5475,7 @@
           <w:color w:val="374151"/>
           <w:sz w:val="24"/>
         </w:rPr>
-        <w:t>Sinh viên, Cổng thanh toán (VNPay), Ban quản lý KTX.</w:t>
+        <w:t>Sinh viên, Cổng thanh toán (VNPay), Hệ thống (System).</w:t>
       </w:r>
     </w:p>
     <w:p>
@@ -5610,7 +5610,7 @@
           <w:color w:val="374151"/>
           <w:sz w:val="24"/>
         </w:rPr>
-        <w:t>Ban quản lý KTX / Ban Giám đốc KTX.</w:t>
+        <w:t>Hệ thống (System) / Ban Giám đốc KTX.</w:t>
       </w:r>
     </w:p>
     <w:p>
@@ -5737,7 +5737,7 @@
           <w:color w:val="1F2937"/>
           <w:sz w:val="23"/>
         </w:rPr>
-        <w:t>Dạ thưa Thầy, 'Business Approve' (UC-09) là cánh cổng kiểm soát nghiệp vụ của Ban quản lý theo Quy tắc BR-03. Không một tổ chức ký túc xá nào cho phép sinh viên cứ điền form là tự động vào ở ngay. KTX phải thẩm định: (1) Sinh viên có đúng là sinh viên trường A không theo BR-01; (2) Sinh viên có vi phạm kỷ luật nội trú cũ không; (3) Sinh viên có cam kết ở đủ tối thiểu 1 học kỳ theo BR-02 không. Chỉ khi hồ sơ được BQL phê duyệt 'Business Approve', sinh viên mới được đưa vào danh sách chính thức để chạy thuật toán phân phòng.</w:t>
+        <w:t>Dạ thưa Thầy, 'Business Approve' (UC-09) là cánh cổng kiểm soát nghiệp vụ của Ban quản lý theo Quy tắc BR-03. Không một tổ chức ký túc xá nào cho phép sinh viên cứ điền form là tự động vào ở ngay. KTX phải thẩm định: (1) Sinh viên có đúng là sinh viên trường A không theo BR-01; (2) Sinh viên có vi phạm kỷ luật nội trú cũ không; (3) Sinh viên có cam kết ở đủ tối thiểu 1 học kỳ theo BR-02 không. Chỉ khi hồ sơ được Hệ thống phê duyệt 'Business Approve', sinh viên mới được đưa vào danh sách chính thức để chạy thuật toán phân phòng.</w:t>
       </w:r>
     </w:p>
     <w:p>

</xml_diff>